<commit_message>
Add configurable inline inventory grouping
</commit_message>
<xml_diff>
--- a/templates/contract_shmidt.docx
+++ b/templates/contract_shmidt.docx
@@ -9,33 +9,33 @@
         <w:jc w:val="center"/>
       </w:pPr>
       <w:r>
-        <w:t>??????? ?{{CONTRACT_NUMBER}}</w:t>
-      </w:r>
-    </w:p>
-    <w:p>
-      <w:pPr>
-        <w:spacing w:after="0" w:line="240" w:lineRule="auto"/>
-      </w:pPr>
-      <w:r>
-        <w:t>?. ???????</w:t>
+        <w:t>ДОГОВОР №{{CONTRACT_NUMBER}}</w:t>
+      </w:r>
+    </w:p>
+    <w:p>
+      <w:pPr>
+        <w:spacing w:after="0" w:line="240" w:lineRule="auto"/>
+      </w:pPr>
+      <w:r>
+        <w:t>г. Грозный</w:t>
         <w:tab/>
         <w:tab/>
         <w:tab/>
-        <w:t>{{CONTRACT_DATE}} ?.</w:t>
-      </w:r>
-    </w:p>
-    <w:p>
-      <w:pPr>
-        <w:spacing w:after="0" w:line="240" w:lineRule="auto"/>
-      </w:pPr>
-    </w:p>
-    <w:p>
-      <w:pPr>
-        <w:spacing w:after="0" w:line="240" w:lineRule="auto"/>
-        <w:jc w:val="both"/>
-      </w:pPr>
-      <w:r>
-        <w:t>?????????????? ??????????????? ????? ?????? ????????????, ????????? ? ?????????? ?????????, ? ???? ?????? ?????? ?????????????, ???????????? ?? ????????? ????????????? ? ??????????? ?326200000045173, ? ????? ???????, ? {{BUYER_INTRO}}, ? ?????? ???????, ? ?????? ????????? ?????????, ????????? ????????? ??????? ? ?????????????:</w:t>
+        <w:t>{{CONTRACT_DATE}} г.</w:t>
+      </w:r>
+    </w:p>
+    <w:p>
+      <w:pPr>
+        <w:spacing w:after="0" w:line="240" w:lineRule="auto"/>
+      </w:pPr>
+    </w:p>
+    <w:p>
+      <w:pPr>
+        <w:spacing w:after="0" w:line="240" w:lineRule="auto"/>
+        <w:jc w:val="both"/>
+      </w:pPr>
+      <w:r>
+        <w:t>Индивидуальный предприниматель Шмидт Андрей Владимирович, именуемый в дальнейшем ПОСТАВЩИК, в лице Шмидта Андрея Владимировича, действующего на основании свидетельства о регистрации №326200000045173, с одной СТОРОНЫ, и {{BUYER_INTRO}}, с другой СТОРОНЫ, а вместе именуемые СТОРОНАМИ, заключили настоящий договор о нижеследующем:</w:t>
       </w:r>
     </w:p>
     <w:p>

</xml_diff>